<commit_message>
docs(submission): 重同步 10 份配套 docx 至当前 md 源
本轮发现：团队在 10-06 交付收尾后又于 10-10~10-12 更新了 7 份 md 源
（开发说明书/快速启动指南/技术方案说明书/测试说明书/系统架构设计文档/
软件需求规格说明书/DEPLOY），使原 Oct-08 生成的 docx 再次落后于 md。
属同一类「docx 落后于 md」问题复发，需再同步。

处置：从本仓历史 commit 621834d 恢复 _md2docx.py（该脚本此前被清理提交
48c2d42 删除，本 commit 不重新纳入版本控制，仅在本地用于本次重生成，
是否重新入库待团队裁决），重跑生成全部 10 份 docx。

验证（python-docx 抽 paragraphs+tables 全文）：
- 10/10 docx 的 mtime 均晚于对应 md（消除二次漂移）
- 禁用旧串全 0 命中：MARS / MARS-408 / 火山杯 / 2026 作品路演 /
  2026 福建高校 / 451 / 243 端点 / 35 路由 / 35 routes / 923 / 1139 /
  1177 / 1168 / 54.08 / 门禁 54 / 915 / 提 e2e / 6.8413
- 当前主线关键词均存在：芒得很职(全10份) / 国创赛(6份) / 职业素养(全10份)
  / 闽江大学(多份)；其中系统架构设计文档、开发说明书等含「国创赛·高教
  主赛道·创意组」完整赛事名
- md 源当前仅剩「408」作为科目的合法用法（如「计算机 408 四科为已落地
  演示学科」）与「软件竞赛」历史架构债分析（该文档本就定位为软件竞赛阶段
  历史快照），均未把产品定性为 408 考研产品，符合禁区约束

未改动：PPT（submission/01_演示PPT/作品演示PPT-最终版.pptx，11 页，
已于 10-06 完成并验旧串 0 命中）、src/、py-server/ 源码与测试、
03_演示视频/、04_源码/、任何 zip。
</commit_message>
<xml_diff>
--- a/submission/02_配套文档/docx/DEPLOY.docx
+++ b/submission/02_配套文档/docx/DEPLOY.docx
@@ -129,7 +129,7 @@
           <w:color w:val="666666"/>
           <w:sz w:val="20"/>
         </w:rPr>
-        <w:t>基于 GOMARL 与 FrugalRAG 的 408 考研个性化学习系统</w:t>
+        <w:t>基于 GOMARL 与 FrugalRAG 的多智能体个性化学习与实训系统（408 计算机四科为已落地演示学科）</w:t>
       </w:r>
       <w:r>
         <w:br/>
@@ -4461,7 +4461,7 @@
                 <w:color w:val="1A1A2E"/>
                 <w:sz w:val="18"/>
               </w:rPr>
-              <w:t>缺失，待录制</w:t>
+              <w:t>待更新</w:t>
             </w:r>
           </w:p>
         </w:tc>
@@ -4481,27 +4481,7 @@
                 <w:color w:val="1A1A2E"/>
                 <w:sz w:val="18"/>
               </w:rPr>
-              <w:t>提交物，非开发阻塞。当前主线（计算机类学生职业素养对抗实训平台）</w:t>
-            </w:r>
-            <w:r>
-              <w:rPr>
-                <w:rFonts w:ascii="Calibri" w:hAnsi="Calibri" w:eastAsia="宋体"/>
-                <w:b/>
-                <w:i w:val="0"/>
-                <w:color w:val="1A1A2E"/>
-                <w:sz w:val="18"/>
-              </w:rPr>
-              <w:t>尚无演示视频</w:t>
-            </w:r>
-            <w:r>
-              <w:rPr>
-                <w:rFonts w:ascii="Calibri" w:hAnsi="Calibri" w:eastAsia="宋体"/>
-                <w:b w:val="0"/>
-                <w:i w:val="0"/>
-                <w:color w:val="1A1A2E"/>
-                <w:sz w:val="18"/>
-              </w:rPr>
-              <w:t>；</w:t>
+              <w:t xml:space="preserve">提交物，非开发阻塞。现有 </w:t>
             </w:r>
             <w:r>
               <w:rPr>
@@ -4521,7 +4501,7 @@
                 <w:color w:val="1A1A2E"/>
                 <w:sz w:val="18"/>
               </w:rPr>
-              <w:t xml:space="preserve"> 下仅有 2026-07-21 的 408 旧主线录屏，与当前主线不符</w:t>
+              <w:t xml:space="preserve"> 下 2026-07-21 的 408 演示录屏与已落地演示学科（408 四科）一致，可沿用或重录；若国创赛叙事另需职业素养场景演示则待补</w:t>
             </w:r>
           </w:p>
         </w:tc>

</xml_diff>